<commit_message>
Reword eleven questions in the founder's own terms
Several questions carried framework vocabulary a founder would not use.
"기준 시장" becomes "초기 타겟 시장", "고객이 돈이나 시간을 실제로 쓴 적"
becomes "유료 고객이 있었나요", and the partner and budget questions now
name what they actually ask about rather than gesturing at it.

Only the prompts change. Options, weights, critical flags and the source
mapping back to the v4.0 framework stay as they were, so scoring and the
phase gates are unaffected. The questionnaire docx is regenerated from
the same file.

Co-Authored-By: Claude Opus 5 <noreply@anthropic.com>
</commit_message>
<xml_diff>
--- a/docs/해외진출 준비도 진단 설문 55문항.docx
+++ b/docs/해외진출 준비도 진단 설문 55문항.docx
@@ -970,7 +970,7 @@
           <w:sz w:val="21"/>
           <w:szCs w:val="21"/>
         </w:rPr>
-        <w:t xml:space="preserve">해외 고객의 가치를 확인할 기준 시장이 있나요?</w:t>
+        <w:t xml:space="preserve">해외 고객의 가치를 확인할 초기 타겟 시장이 있나요?</w:t>
       </w:r>
     </w:p>
     <w:p>
@@ -1152,7 +1152,7 @@
           <w:sz w:val="21"/>
           <w:szCs w:val="21"/>
         </w:rPr>
-        <w:t xml:space="preserve">이번 진출에 총 얼마가 들지 계산해보셨나요?</w:t>
+        <w:t xml:space="preserve">이번 해외 진출 계획에 총 얼마가 들지 계산해보셨나요?</w:t>
       </w:r>
     </w:p>
     <w:p>
@@ -1986,7 +1986,7 @@
           <w:sz w:val="21"/>
           <w:szCs w:val="21"/>
         </w:rPr>
-        <w:t xml:space="preserve">고객이 돈이나 시간을 실제로 쓴 적이 있나요?</w:t>
+        <w:t xml:space="preserve">우리 제품이나 서비스에 대한 유료 고객이 있었나요?</w:t>
       </w:r>
     </w:p>
     <w:p>
@@ -2657,7 +2657,7 @@
           <w:sz w:val="21"/>
           <w:szCs w:val="21"/>
         </w:rPr>
-        <w:t xml:space="preserve">목표 국가에서 살 만한 고객이 몇 곳인지 세어보셨나요?</w:t>
+        <w:t xml:space="preserve">초기 타겟 국가(시장)에서 고객이 몇 곳이고 얼마나 되는지 확인해 보셨나요?</w:t>
       </w:r>
     </w:p>
     <w:p>
@@ -3309,7 +3309,7 @@
           <w:sz w:val="21"/>
           <w:szCs w:val="21"/>
         </w:rPr>
-        <w:t xml:space="preserve">인맥이나 지원사업을 빼고 봐도 그 나라가 1순위인가요?</w:t>
+        <w:t xml:space="preserve">인맥이나 지원사업이 없다고 해도 그 초기 타겟 국가(시장)가 1순위인가요?</w:t>
       </w:r>
     </w:p>
     <w:p>
@@ -6889,7 +6889,7 @@
           <w:sz w:val="21"/>
           <w:szCs w:val="21"/>
         </w:rPr>
-        <w:t xml:space="preserve">지금 확인해야 할 가설과 그것을 볼 지표가 정해져 있나요?</w:t>
+        <w:t xml:space="preserve">지금 타겟 시장에서 확인해야 할 가설과 가설을 모니터링 할 지표가 정해져 있나요?</w:t>
       </w:r>
     </w:p>
     <w:p>
@@ -7723,7 +7723,7 @@
           <w:sz w:val="21"/>
           <w:szCs w:val="21"/>
         </w:rPr>
-        <w:t xml:space="preserve">핵심 인력이 자리를 비워도 일이 이어지나요?</w:t>
+        <w:t xml:space="preserve">해외진출에 대한 핵심 인력이 자리를 비워도 일이 계속 될 것이라 생각하시나요?</w:t>
       </w:r>
     </w:p>
     <w:p>
@@ -8557,7 +8557,7 @@
           <w:sz w:val="21"/>
           <w:szCs w:val="21"/>
         </w:rPr>
-        <w:t xml:space="preserve">파트너와 헤어져도 고객을 데려올 수 있나요?</w:t>
+        <w:t xml:space="preserve">파트너와 헤어져도 고객을 확보 할 수 있나요?</w:t>
       </w:r>
     </w:p>
     <w:p>
@@ -8720,7 +8720,7 @@
           <w:sz w:val="21"/>
           <w:szCs w:val="21"/>
         </w:rPr>
-        <w:t xml:space="preserve">그 파트너를 다른 곳으로 바꿀 수 있나요?</w:t>
+        <w:t xml:space="preserve">그 파트너를 다른 업체나 인력으로 바꿀 수 있나요?</w:t>
       </w:r>
     </w:p>
     <w:p>
@@ -8883,7 +8883,7 @@
           <w:sz w:val="21"/>
           <w:szCs w:val="21"/>
         </w:rPr>
-        <w:t xml:space="preserve">한 파트너에 얼마나 의존해도 되는지 선을 정하셨나요?</w:t>
+        <w:t xml:space="preserve">한 파트너에 얼마나 의존 할 지 기준을 정하셨나요?</w:t>
       </w:r>
     </w:p>
     <w:p>
@@ -9391,7 +9391,7 @@
           <w:sz w:val="21"/>
           <w:szCs w:val="21"/>
         </w:rPr>
-        <w:t xml:space="preserve">조건부로 계속할 때의 한도를 정해두셨나요?</w:t>
+        <w:t xml:space="preserve">해외진출 사업에서 조건부로 계속 진행 할 때 그 예산 한도를 정해 두었나요?</w:t>
       </w:r>
     </w:p>
     <w:p>

</xml_diff>